<commit_message>
Update the 3rd party open source docs to cover Nmap 7.99
</commit_message>
<xml_diff>
--- a/docs/Nmap-Third-Party-Open-Source.docx
+++ b/docs/Nmap-Third-Party-Open-Source.docx
@@ -190,7 +190,21 @@
         <w:rPr>
           <w:szCs w:val="22"/>
         </w:rPr>
-        <w:t xml:space="preserve"> software and libraries used by Nmap proper. It does not cover our related tools such as Zenmap, </w:t>
+        <w:t xml:space="preserve"> software and libraries used by Nmap proper. It does not cover our related tools such as </w:t>
+      </w:r>
+      <w:proofErr w:type="spellStart"/>
+      <w:r>
+        <w:rPr>
+          <w:szCs w:val="22"/>
+        </w:rPr>
+        <w:t>Zenmap</w:t>
+      </w:r>
+      <w:proofErr w:type="spellEnd"/>
+      <w:r>
+        <w:rPr>
+          <w:szCs w:val="22"/>
+        </w:rPr>
+        <w:t xml:space="preserve">, </w:t>
       </w:r>
       <w:proofErr w:type="spellStart"/>
       <w:r>
@@ -332,7 +346,7 @@
           <w:bCs/>
           <w:szCs w:val="22"/>
         </w:rPr>
-        <w:t>5</w:t>
+        <w:t>9</w:t>
       </w:r>
       <w:r>
         <w:rPr>
@@ -691,21 +705,7 @@
         <w:rPr>
           <w:szCs w:val="22"/>
         </w:rPr>
-        <w:t xml:space="preserve"> (for filesystem operations), </w:t>
-      </w:r>
-      <w:proofErr w:type="spellStart"/>
-      <w:r>
-        <w:rPr>
-          <w:szCs w:val="22"/>
-        </w:rPr>
-        <w:t>LPeg</w:t>
-      </w:r>
-      <w:proofErr w:type="spellEnd"/>
-      <w:r>
-        <w:rPr>
-          <w:szCs w:val="22"/>
-        </w:rPr>
-        <w:t xml:space="preserve"> (Lua Parsing Expression Grammars), </w:t>
+        <w:t xml:space="preserve"> (for filesystem operations), LPeg (Lua Parsing Expression Grammars), </w:t>
       </w:r>
       <w:proofErr w:type="spellStart"/>
       <w:r>
@@ -1087,13 +1087,13 @@
         <w:rPr>
           <w:szCs w:val="22"/>
         </w:rPr>
-        <w:t>: 1.7</w:t>
-      </w:r>
-      <w:r>
-        <w:rPr>
-          <w:szCs w:val="22"/>
-        </w:rPr>
-        <w:t>9</w:t>
+        <w:t>: 1.</w:t>
+      </w:r>
+      <w:r>
+        <w:rPr>
+          <w:szCs w:val="22"/>
+        </w:rPr>
+        <w:t>87</w:t>
       </w:r>
     </w:p>
     <w:p>
@@ -1161,21 +1161,7 @@
         <w:rPr>
           <w:szCs w:val="22"/>
         </w:rPr>
-        <w:t xml:space="preserve"> software components whose BSD-style licenses also must be respected. They all allow free redistribution </w:t>
-      </w:r>
-      <w:proofErr w:type="gramStart"/>
-      <w:r>
-        <w:rPr>
-          <w:szCs w:val="22"/>
-        </w:rPr>
-        <w:t>within</w:t>
-      </w:r>
-      <w:proofErr w:type="gramEnd"/>
-      <w:r>
-        <w:rPr>
-          <w:szCs w:val="22"/>
-        </w:rPr>
-        <w:t xml:space="preserve"> commercial software and are detailed in </w:t>
+        <w:t xml:space="preserve"> software components whose BSD-style licenses also must be respected. They all allow free redistribution within commercial software and are detailed in </w:t>
       </w:r>
       <w:hyperlink r:id="rId31">
         <w:r>
@@ -1407,7 +1393,45 @@
         <w:rPr>
           <w:szCs w:val="22"/>
         </w:rPr>
-        <w:t>: 1.10.4 (this is the version in the Nmap source code, the Linux binaries, and in Npcap 1.75)</w:t>
+        <w:t>: 1.10.</w:t>
+      </w:r>
+      <w:r>
+        <w:rPr>
+          <w:szCs w:val="22"/>
+        </w:rPr>
+        <w:t>6</w:t>
+      </w:r>
+      <w:r>
+        <w:rPr>
+          <w:szCs w:val="22"/>
+        </w:rPr>
+        <w:t xml:space="preserve"> (this is the version in the Nmap source code, the Linux binaries, and in </w:t>
+      </w:r>
+      <w:proofErr w:type="spellStart"/>
+      <w:r>
+        <w:rPr>
+          <w:szCs w:val="22"/>
+        </w:rPr>
+        <w:t>Npcap</w:t>
+      </w:r>
+      <w:proofErr w:type="spellEnd"/>
+      <w:r>
+        <w:rPr>
+          <w:szCs w:val="22"/>
+        </w:rPr>
+        <w:t xml:space="preserve"> 1.</w:t>
+      </w:r>
+      <w:r>
+        <w:rPr>
+          <w:szCs w:val="22"/>
+        </w:rPr>
+        <w:t>87</w:t>
+      </w:r>
+      <w:r>
+        <w:rPr>
+          <w:szCs w:val="22"/>
+        </w:rPr>
+        <w:t>)</w:t>
       </w:r>
     </w:p>
     <w:p>
@@ -1592,7 +1616,13 @@
         <w:rPr>
           <w:szCs w:val="22"/>
         </w:rPr>
-        <w:t>: 1.12</w:t>
+        <w:t>: 1.1</w:t>
+      </w:r>
+      <w:r>
+        <w:rPr>
+          <w:szCs w:val="22"/>
+        </w:rPr>
+        <w:t>8.0</w:t>
       </w:r>
     </w:p>
     <w:p>
@@ -1834,7 +1864,13 @@
         <w:rPr>
           <w:szCs w:val="22"/>
         </w:rPr>
-        <w:t>10.43</w:t>
+        <w:t>10.4</w:t>
+      </w:r>
+      <w:r>
+        <w:rPr>
+          <w:szCs w:val="22"/>
+        </w:rPr>
+        <w:t>7</w:t>
       </w:r>
     </w:p>
     <w:p>
@@ -2023,7 +2059,7 @@
         <w:rPr>
           <w:szCs w:val="22"/>
         </w:rPr>
-        <w:t>6</w:t>
+        <w:t>8</w:t>
       </w:r>
     </w:p>
     <w:p>
@@ -2171,21 +2207,7 @@
         <w:rPr>
           <w:szCs w:val="22"/>
         </w:rPr>
-        <w:t xml:space="preserve"> (for filesystem operations), </w:t>
-      </w:r>
-      <w:proofErr w:type="spellStart"/>
-      <w:r>
-        <w:rPr>
-          <w:szCs w:val="22"/>
-        </w:rPr>
-        <w:t>LPeg</w:t>
-      </w:r>
-      <w:proofErr w:type="spellEnd"/>
-      <w:r>
-        <w:rPr>
-          <w:szCs w:val="22"/>
-        </w:rPr>
-        <w:t xml:space="preserve"> (Lua Parsing Expression Grammars), </w:t>
+        <w:t xml:space="preserve"> (for filesystem operations), LPeg (Lua Parsing Expression Grammars), </w:t>
       </w:r>
       <w:proofErr w:type="spellStart"/>
       <w:r>
@@ -2431,23 +2453,13 @@
           <w:szCs w:val="22"/>
         </w:rPr>
       </w:pPr>
-      <w:proofErr w:type="spellStart"/>
-      <w:r>
-        <w:rPr>
-          <w:b/>
-          <w:bCs/>
-          <w:szCs w:val="22"/>
-        </w:rPr>
-        <w:t>LPeg</w:t>
-      </w:r>
-      <w:proofErr w:type="spellEnd"/>
-      <w:r>
-        <w:rPr>
-          <w:b/>
-          <w:bCs/>
-          <w:szCs w:val="22"/>
-        </w:rPr>
-        <w:t xml:space="preserve"> URL</w:t>
+      <w:r>
+        <w:rPr>
+          <w:b/>
+          <w:bCs/>
+          <w:szCs w:val="22"/>
+        </w:rPr>
+        <w:t>LPeg URL</w:t>
       </w:r>
       <w:r>
         <w:rPr>
@@ -2475,23 +2487,13 @@
           <w:szCs w:val="22"/>
         </w:rPr>
       </w:pPr>
-      <w:proofErr w:type="spellStart"/>
-      <w:r>
-        <w:rPr>
-          <w:b/>
-          <w:bCs/>
-          <w:szCs w:val="22"/>
-        </w:rPr>
-        <w:t>LPeg</w:t>
-      </w:r>
-      <w:proofErr w:type="spellEnd"/>
-      <w:r>
-        <w:rPr>
-          <w:b/>
-          <w:bCs/>
-          <w:szCs w:val="22"/>
-        </w:rPr>
-        <w:t xml:space="preserve"> Version</w:t>
+      <w:r>
+        <w:rPr>
+          <w:b/>
+          <w:bCs/>
+          <w:szCs w:val="22"/>
+        </w:rPr>
+        <w:t>LPeg Version</w:t>
       </w:r>
       <w:r>
         <w:rPr>
@@ -2510,23 +2512,13 @@
           <w:szCs w:val="22"/>
         </w:rPr>
       </w:pPr>
-      <w:proofErr w:type="spellStart"/>
-      <w:r>
-        <w:rPr>
-          <w:b/>
-          <w:bCs/>
-          <w:szCs w:val="22"/>
-        </w:rPr>
-        <w:t>LPeg</w:t>
-      </w:r>
-      <w:proofErr w:type="spellEnd"/>
-      <w:r>
-        <w:rPr>
-          <w:b/>
-          <w:bCs/>
-          <w:szCs w:val="22"/>
-        </w:rPr>
-        <w:t xml:space="preserve"> Copyright Statement</w:t>
+      <w:r>
+        <w:rPr>
+          <w:b/>
+          <w:bCs/>
+          <w:szCs w:val="22"/>
+        </w:rPr>
+        <w:t>LPeg Copyright Statement</w:t>
       </w:r>
       <w:r>
         <w:rPr>
@@ -2943,7 +2935,19 @@
         <w:rPr>
           <w:szCs w:val="22"/>
         </w:rPr>
-        <w:t>: 3.0.8 in the binaries we distribute. If you build Nmap yourself and include OpenSSL, you supply your own preferred version.</w:t>
+        <w:t>: 3.0.</w:t>
+      </w:r>
+      <w:r>
+        <w:rPr>
+          <w:szCs w:val="22"/>
+        </w:rPr>
+        <w:t>19</w:t>
+      </w:r>
+      <w:r>
+        <w:rPr>
+          <w:szCs w:val="22"/>
+        </w:rPr>
+        <w:t xml:space="preserve"> in the binaries we distribute. If you build Nmap yourself and include OpenSSL, you supply your own preferred version.</w:t>
       </w:r>
     </w:p>
     <w:p>
@@ -3142,7 +3146,13 @@
         <w:rPr>
           <w:szCs w:val="22"/>
         </w:rPr>
-        <w:t>2.47</w:t>
+        <w:t>2.</w:t>
+      </w:r>
+      <w:r>
+        <w:rPr>
+          <w:szCs w:val="22"/>
+        </w:rPr>
+        <w:t>50</w:t>
       </w:r>
     </w:p>
     <w:p>
@@ -3518,7 +3528,13 @@
         <w:rPr>
           <w:szCs w:val="22"/>
         </w:rPr>
-        <w:t>11.0</w:t>
+        <w:t>11.</w:t>
+      </w:r>
+      <w:r>
+        <w:rPr>
+          <w:szCs w:val="22"/>
+        </w:rPr>
+        <w:t>1</w:t>
       </w:r>
     </w:p>
     <w:p>
@@ -3737,7 +3753,13 @@
         <w:rPr>
           <w:szCs w:val="22"/>
         </w:rPr>
-        <w:t>3.1</w:t>
+        <w:t>3.</w:t>
+      </w:r>
+      <w:r>
+        <w:rPr>
+          <w:szCs w:val="22"/>
+        </w:rPr>
+        <w:t>2</w:t>
       </w:r>
     </w:p>
     <w:p>
@@ -5806,7 +5828,6 @@
     <w:rPr>
       <w:color w:val="800000"/>
       <w:u w:val="single"/>
-      <w:lang/>
     </w:rPr>
   </w:style>
   <w:style w:type="paragraph" w:customStyle="1" w:styleId="Heading">

</xml_diff>